<commit_message>
build(bo-nop): đồng bộ bộ nộp hoàn chỉnh với nội dung đã khử giọng AI
Dựng lại dist/BO_NOP_HOAN_CHINH_2026-06 từ Markdown nguồn đã chỉnh văn phong:
- 3_luan_an_chuong_phu_luc/: LUAN_AN_CTU_full.pdf (188 trang, phân trang La Mã
  i–xi rồi Ả Rập từ Chương 1), chương 1–5 (.pdf/.docx), phần đầu/TLTK/Phụ lục
  A–B (.docx) — tất cả phản ánh bản de-AI + Lời cảm ơn hoàn chỉnh.
- 2_chuyen_de/: CD1/CD2 (.pdf/.docx) dựng lại.
- Sinh lại các .tex chương rời trong latex/ctu.

Xác minh: cụm calque cũ ("phòng thí nghiệm thực địa", "Đỉnh của kiến trúc") = 0
trong .docx bộ nộp; bản dịch VI papers giữ cấu trúc 00_ban_dich_vi.docx (đã loại
file trùng tên cũ 04_).

Co-Authored-By: Claude Opus 4.8 (1M context) <noreply@anthropic.com>
Claude-Session: https://claude.ai/code/session_01Xumaoraa2DLWLXsgJJ62oq
</commit_message>
<xml_diff>
--- a/dist/BO_NOP_HOAN_CHINH_2026-06/3_luan_an_chuong_phu_luc/00_phan_dau_vi.docx
+++ b/dist/BO_NOP_HOAN_CHINH_2026-06/3_luan_an_chuong_phu_luc/00_phan_dau_vi.docx
@@ -16,18 +16,71 @@
         <w:pStyle w:val="FirstParagraph"/>
       </w:pPr>
       <w:r>
+        <w:t xml:space="preserve">Trong suốt quá trình học tập và thực hiện luận án, tôi đã nhận được sự giúp đỡ quý báu từ nhiều thầy cô, đồng nghiệp và người thân.</w:t>
+      </w:r>
+    </w:p>
+    <w:p>
+      <w:pPr>
+        <w:pStyle w:val="BodyText"/>
+      </w:pPr>
+      <w:r>
+        <w:t xml:space="preserve">Trước hết, tôi xin bày tỏ lòng biết ơn sâu sắc đến PGS.TS. Phan Anh Tú, người hướng dẫn khoa học, đã tận tình chỉ bảo, định hướng và động viên tôi trong suốt thời gian nghiên cứu.</w:t>
+      </w:r>
+    </w:p>
+    <w:p>
+      <w:pPr>
+        <w:pStyle w:val="BodyText"/>
+      </w:pPr>
+      <w:r>
+        <w:t xml:space="preserve">Tôi xin chân thành cảm ơn Quý Thầy, Cô của Trường Kinh tế và Khoa Sau đại học, Trường Đại học Cần Thơ đã giảng dạy và tạo điều kiện thuận lợi cho tôi trong quá trình học tập.</w:t>
+      </w:r>
+    </w:p>
+    <w:p>
+      <w:pPr>
+        <w:pStyle w:val="BodyText"/>
+      </w:pPr>
+      <w:r>
+        <w:t xml:space="preserve">Tôi cũng xin cảm ơn Ban Giám hiệu cùng các đồng nghiệp ở Trường Đại học Kỹ thuật – Công nghệ Vĩnh Long đã hỗ trợ và chia sẻ công việc để tôi có thể theo học chương trình nghiên cứu sinh.</w:t>
+      </w:r>
+    </w:p>
+    <w:p>
+      <w:pPr>
+        <w:pStyle w:val="BodyText"/>
+      </w:pPr>
+      <w:r>
+        <w:t xml:space="preserve">Cuối cùng, tôi xin gửi lời cảm ơn đến gia đình đã luôn bên cạnh, là chỗ dựa để tôi vượt qua khó khăn và hoàn thành luận án này.</w:t>
+      </w:r>
+    </w:p>
+    <w:p>
+      <w:pPr>
+        <w:pStyle w:val="BodyText"/>
+      </w:pPr>
+      <w:r>
         <w:rPr>
           <w:iCs/>
           <w:i/>
         </w:rPr>
-        <w:t xml:space="preserve">(NCS hoàn thiện: cảm ơn người hướng dẫn khoa học, Trường Kinh tế và Trường Đại học Cần Thơ, Trường Đại học Kỹ thuật – Công nghệ Vĩnh Long, gia đình và đồng nghiệp.)</w:t>
-      </w:r>
-    </w:p>
-    <w:p>
-      <w:r>
-        <w:pict>
-          <v:rect style="width:0;height:1.5pt" o:hralign="center" o:hrstd="t" o:hr="t"/>
-        </w:pict>
+        <w:t xml:space="preserve">Cần Thơ, ngày … tháng … năm 2026</w:t>
+      </w:r>
+    </w:p>
+    <w:p>
+      <w:pPr>
+        <w:pStyle w:val="BodyText"/>
+      </w:pPr>
+      <w:r>
+        <w:rPr>
+          <w:bCs/>
+          <w:b/>
+        </w:rPr>
+        <w:t xml:space="preserve">Tác giả</w:t>
+      </w:r>
+    </w:p>
+    <w:p>
+      <w:pPr>
+        <w:pStyle w:val="BodyText"/>
+      </w:pPr>
+      <w:r>
+        <w:t xml:space="preserve">Đỗ Thùy Hương</w:t>
       </w:r>
     </w:p>
     <w:bookmarkEnd w:id="20"/>
@@ -45,7 +98,7 @@
         <w:pStyle w:val="FirstParagraph"/>
       </w:pPr>
       <w:r>
-        <w:t xml:space="preserve">Luận án nghiên cứu mối quan hệ giữa quốc tế hóa và hiệu quả hoạt động kinh doanh của doanh nghiệp (internationalization–firm performance, I–P) tại châu Á, tập trung làm rõ các điều kiện biên giải thích sự dị biệt cao trong mối quan hệ này. Trên cơ sở tích hợp bốn lý thuyết kinh điển, mô hình Uppsala, lý thuyết dựa trên nguồn lực (RBV), lý thuyết thể chế và lý thuyết thượng tầng quản trị, cùng lớp mở rộng về năng lực số, luận án xây dựng khung giải thích đa tầng CDCM (Country–Digital–Capability Moderation) với ba tầng điều tiết: bối cảnh thể chế (vận hành hóa bằng khung phân loại ICRV sáu nhóm), năng lực số (phân tách năng lực công nghệ TCI và chỉ số chấp nhận số DAI), và đặc điểm nhà quản trị cấp cao. Luận điểm trọng tâm mà luận án đề xuất và kiểm định có điều kiện là thể chế không chỉ điều tiết độ lớn mà còn có thể định hình dấu và dạng hình của quan hệ I–P; ở cực trị thể chế yếu nhất, bằng chứng cho thấy họ mô hình chữ U ngược có xu hướng không còn áp dụng. Bằng chứng về vai trò định hình dạng hàm là có điều kiện và phụ thuộc bối cảnh, không phổ quát trên toàn mẫu (xem Chương 4).</w:t>
+        <w:t xml:space="preserve">Luận án nghiên cứu mối quan hệ giữa quốc tế hóa và hiệu quả hoạt động kinh doanh của doanh nghiệp (internationalization–firm performance, I–P) tại châu Á, tập trung làm rõ các điều kiện biên giải thích sự dị biệt cao trong mối quan hệ này. Luận án tích hợp bốn lý thuyết nền tảng (mô hình Uppsala, lý thuyết dựa trên nguồn lực RBV, lý thuyết thể chế và lý thuyết thượng tầng quản trị) cùng một lớp mở rộng về năng lực số để xây dựng khung giải thích đa tầng CDCM (Country–Digital–Capability Moderation). Khung này gồm ba tầng điều tiết: bối cảnh thể chế (vận hành hóa bằng khung phân loại ICRV sáu nhóm), năng lực số (phân tách năng lực công nghệ TCI và chỉ số chấp nhận số DAI), và đặc điểm nhà quản trị cấp cao. Luận điểm trọng tâm của luận án là thể chế không chỉ điều tiết độ lớn mà còn có thể định hình dấu và dạng hình của quan hệ I–P; ở cực trị thể chế yếu nhất, bằng chứng cho thấy họ mô hình chữ U ngược dường như không còn phù hợp. Đây là luận điểm được luận án đề xuất và kiểm định có điều kiện. Bằng chứng về vai trò định hình dạng hàm chỉ xuất hiện trong một số bối cảnh nhất định, không đúng cho toàn bộ mẫu (xem Chương 4).</w:t>
       </w:r>
     </w:p>
     <w:p>
@@ -71,7 +124,7 @@
           <w:bCs/>
           <w:b/>
         </w:rPr>
-        <w:t xml:space="preserve">nâng mặt bằng hiệu quả một cách phổ quát</w:t>
+        <w:t xml:space="preserve">nâng mặt bằng hiệu quả ở mọi bối cảnh</w:t>
       </w:r>
       <w:r>
         <w:t xml:space="preserve"> </w:t>
@@ -93,7 +146,7 @@
         <w:t xml:space="preserve"> </w:t>
       </w:r>
       <w:r>
-        <w:t xml:space="preserve">của chúng không phổ quát: trên toàn mẫu 50 nền các tương tác với đường cong không đạt ý nghĩa thống kê, và chỉ định hình rõ ở bối cảnh đơn quốc gia đặc thù (điển hình là hiệu ứng</w:t>
+        <w:t xml:space="preserve">của chúng thì không phổ quát: trên toàn mẫu 50 nền các tương tác với đường cong không đạt ý nghĩa thống kê, và chỉ định hình rõ ở bối cảnh đơn quốc gia đặc thù (điển hình là hiệu ứng</w:t>
       </w:r>
       <w:r>
         <w:t xml:space="preserve"> </w:t>
@@ -144,7 +197,7 @@
         <w:t xml:space="preserve"> </w:t>
       </w:r>
       <w:r>
-        <w:t xml:space="preserve">(độ dốc không có ý nghĩa và độ cong chỉ đạt mức biên), với quan hệ nghiêng về một dạng âm đơn điệu như trường hợp giới hạn lý thuyết được luận án đặt tên là</w:t>
+        <w:t xml:space="preserve">(độ dốc không có ý nghĩa và độ cong chỉ đạt mức biên), với quan hệ nghiêng về dạng âm đơn điệu, một trường hợp biên lý thuyết mà luận án đặt tên là</w:t>
       </w:r>
       <w:r>
         <w:t xml:space="preserve"> </w:t>
@@ -181,13 +234,6 @@
         <w:t xml:space="preserve">quốc tế hóa; hiệu quả hoạt động kinh doanh của doanh nghiệp; thể chế; năng lực số; nhà quản trị cấp cao; châu Á; WBES; phi tuyến chữ U ngược.</w:t>
       </w:r>
     </w:p>
-    <w:p>
-      <w:r>
-        <w:pict>
-          <v:rect style="width:0;height:1.5pt" o:hralign="center" o:hrstd="t" o:hr="t"/>
-        </w:pict>
-      </w:r>
-    </w:p>
     <w:bookmarkEnd w:id="21"/>
     <w:bookmarkStart w:id="22" w:name="abstract"/>
     <w:p>
@@ -380,13 +426,6 @@
       </w:pPr>
       <w:r>
         <w:t xml:space="preserve">Đỗ Thùy Hương</w:t>
-      </w:r>
-    </w:p>
-    <w:p>
-      <w:r>
-        <w:pict>
-          <v:rect style="width:0;height:1.5pt" o:hralign="center" o:hrstd="t" o:hr="t"/>
-        </w:pict>
       </w:r>
     </w:p>
     <w:bookmarkEnd w:id="23"/>
@@ -713,13 +752,6 @@
       </w:pPr>
       <w:r>
         <w:t xml:space="preserve">Hình 4.8. Họ đường cong quốc tế hóa và hiệu quả phụ thuộc chế độ thể chế ICRV (Chương 4, Mục 4.6.2)</w:t>
-      </w:r>
-    </w:p>
-    <w:p>
-      <w:r>
-        <w:pict>
-          <v:rect style="width:0;height:1.5pt" o:hralign="center" o:hrstd="t" o:hr="t"/>
-        </w:pict>
       </w:r>
     </w:p>
     <w:bookmarkEnd w:id="25"/>
@@ -2040,13 +2072,6 @@
         </w:tc>
       </w:tr>
     </w:tbl>
-    <w:p>
-      <w:r>
-        <w:pict>
-          <v:rect style="width:0;height:1.5pt" o:hralign="center" o:hrstd="t" o:hr="t"/>
-        </w:pict>
-      </w:r>
-    </w:p>
     <w:bookmarkEnd w:id="26"/>
     <w:bookmarkStart w:id="27" w:name="X3131bb7fa4eac4deea1bc52d0a917d3422a5919"/>
     <w:p>

</xml_diff>

<commit_message>
build: đồng bộ Word + bộ nộp + zip với Danh mục Bảng/Hình có số trang
Dựng lại dist/word, dist/luan_an_ctu, bộ nộp BO_NOP_HOAN_CHINH_2026-06 (full PDF
188 trang + chương/phụ lục) và nén lại .zip để khớp Danh mục Bảng/Hình dạng bảng
có số trang. Số trang chuẩn theo bản PDF; .docx cần cập nhật lại nếu nộp bằng Word.

Co-Authored-By: Claude Opus 4.8 (1M context) <noreply@anthropic.com>
Claude-Session: https://claude.ai/code/session_01Xumaoraa2DLWLXsgJJ62oq
</commit_message>
<xml_diff>
--- a/dist/BO_NOP_HOAN_CHINH_2026-06/3_luan_an_chuong_phu_luc/00_phan_dau_vi.docx
+++ b/dist/BO_NOP_HOAN_CHINH_2026-06/3_luan_an_chuong_phu_luc/00_phan_dau_vi.docx
@@ -438,192 +438,744 @@
         <w:t xml:space="preserve">DANH MỤC BẢNG</w:t>
       </w:r>
     </w:p>
-    <w:p>
-      <w:pPr>
-        <w:pStyle w:val="FirstParagraph"/>
-      </w:pPr>
-      <w:r>
-        <w:rPr>
-          <w:bCs/>
-          <w:b/>
-        </w:rPr>
-        <w:t xml:space="preserve">Bảng đánh số:</w:t>
-      </w:r>
-      <w:r>
-        <w:t xml:space="preserve"> </w:t>
-      </w:r>
-      <w:r>
-        <w:t xml:space="preserve">- Bảng 2.1. Tổng hợp hệ giả thuyết: phát biểu, dấu kỳ vọng, cơ sở lý thuyết và biến kiểm định (Chương 2, Mục 2.5.8)</w:t>
-      </w:r>
-      <w:r>
-        <w:t xml:space="preserve"> </w:t>
-      </w:r>
-      <w:r>
-        <w:t xml:space="preserve">- Bảng 2.2. Ánh xạ nghiên cứu thành phần, mục trình bày, giả thuyết (Chương 2, Mục 2.5.9)</w:t>
-      </w:r>
-      <w:r>
-        <w:t xml:space="preserve"> </w:t>
-      </w:r>
-      <w:r>
-        <w:t xml:space="preserve">- Bảng 3.1. Tổng hợp biến nghiên cứu của khung thực nghiệm đa quốc gia (Chương 3, Mục 3.3.6)</w:t>
-      </w:r>
-      <w:r>
-        <w:t xml:space="preserve"> </w:t>
-      </w:r>
-      <w:r>
-        <w:t xml:space="preserve">- Bảng 4.1. Phân tán năng suất lao động và đặc điểm quốc tế hóa theo phân nhóm con ICRV (Chương 4, Mục 4.1)</w:t>
-      </w:r>
-      <w:r>
-        <w:t xml:space="preserve"> </w:t>
-      </w:r>
-      <w:r>
-        <w:t xml:space="preserve">- Bảng 4.2. Đổi mới sáng tạo và chấp nhận số theo phân nhóm con ICRV (%) (Chương 4, Mục 4.1)</w:t>
-      </w:r>
-      <w:r>
-        <w:t xml:space="preserve"> </w:t>
-      </w:r>
-      <w:r>
-        <w:t xml:space="preserve">- Bảng 4.3. Đặc trưng doanh nghiệp Nhật Bản 2025 so với năm nền còn lại của Nhóm I (Chương 4, Mục 4.1.5)</w:t>
-      </w:r>
-      <w:r>
-        <w:t xml:space="preserve"> </w:t>
-      </w:r>
-      <w:r>
-        <w:t xml:space="preserve">- Bảng 4.4. Trung vị tỷ suất lợi nhuận trên doanh thu (ROS) theo nhóm ICRV (Chương 4, Mục 4.1.8)</w:t>
-      </w:r>
-      <w:r>
-        <w:t xml:space="preserve"> </w:t>
-      </w:r>
-      <w:r>
-        <w:t xml:space="preserve">- Bảng 4.5. Tiến triển hệ số theo chuỗi mô hình phân tầng, Singapore 2023 (Chương 4, Mục 4.3.8)</w:t>
-      </w:r>
-      <w:r>
-        <w:t xml:space="preserve"> </w:t>
-      </w:r>
-      <w:r>
-        <w:t xml:space="preserve">- Bảng 4.6. Tiến triển mô hình của P7 trên khung 50 nền: điểm uốn và kiểm định Lind–Mehlum (Chương 4, Mục 4.6.1)</w:t>
-      </w:r>
-      <w:r>
-        <w:t xml:space="preserve"> </w:t>
-      </w:r>
-      <w:r>
-        <w:t xml:space="preserve">- Bảng 4.7. Điểm uốn theo nhóm ICRV, khung 50 nền (Chương 4, Mục 4.6.2)</w:t>
-      </w:r>
-      <w:r>
-        <w:t xml:space="preserve"> </w:t>
-      </w:r>
-      <w:r>
-        <w:t xml:space="preserve">- Bảng 4.8. Điểm uốn theo đợt khảo sát, Ấn Độ (Chương 4, Mục 4.8.1)</w:t>
-      </w:r>
-      <w:r>
-        <w:t xml:space="preserve"> </w:t>
-      </w:r>
-      <w:r>
-        <w:t xml:space="preserve">- Bảng 4.9. Hiệu ứng cường độ xuất khẩu lên năng suất qua chuỗi mô hình, Nhật Bản 2025 (Chương 4, Mục 4.9.1)</w:t>
-      </w:r>
-      <w:r>
-        <w:t xml:space="preserve"> </w:t>
-      </w:r>
-      <w:r>
-        <w:t xml:space="preserve">- Bảng 4.10. Tổng hợp ước lượng các nghiên cứu thành phần thực nghiệm (Chương 4, Mục 4.11)</w:t>
-      </w:r>
-      <w:r>
-        <w:t xml:space="preserve"> </w:t>
-      </w:r>
-      <w:r>
-        <w:t xml:space="preserve">- Bảng 5.1. Sợi chỉ vàng tích hợp: câu hỏi nghiên cứu, nghiên cứu thành phần, giả thuyết, phát hiện thực nghiệm chủ chốt, đóng góp lý thuyết (Chương 5, Mục 5.1.8)</w:t>
-      </w:r>
-    </w:p>
-    <w:p>
-      <w:pPr>
-        <w:pStyle w:val="BodyText"/>
-      </w:pPr>
-      <w:r>
-        <w:rPr>
-          <w:bCs/>
-          <w:b/>
-        </w:rPr>
-        <w:t xml:space="preserve">Bảng phụ lục (không đánh số trong danh mục, theo mục):</w:t>
-      </w:r>
-      <w:r>
-        <w:t xml:space="preserve"> </w:t>
-      </w:r>
-      <w:r>
-        <w:t xml:space="preserve">- Bảng C.1. Kết quả hồi quy chính và điểm uốn của tám nghiên cứu thành phần (Phụ lục C, Mục C.1)</w:t>
-      </w:r>
-      <w:r>
-        <w:t xml:space="preserve"> </w:t>
-      </w:r>
-      <w:r>
-        <w:t xml:space="preserve">- Bảng C.2. Chi tiết phân tích tổng hợp ba tầng P6 (Phụ lục C, Mục C.2)</w:t>
-      </w:r>
-      <w:r>
-        <w:t xml:space="preserve"> </w:t>
-      </w:r>
-      <w:r>
-        <w:t xml:space="preserve">- Bảng C.3. Điểm uốn theo sáu nhóm ICRV trong kiểm định toàn mẫu P7 (Phụ lục C, Mục C.3)</w:t>
-      </w:r>
-      <w:r>
-        <w:t xml:space="preserve"> </w:t>
-      </w:r>
-      <w:r>
-        <w:t xml:space="preserve">- Bảng C.4. Tóm tắt kiểm định độ vững theo từng nghiên cứu thành phần (Phụ lục C, Mục C.4)</w:t>
-      </w:r>
-    </w:p>
-    <w:p>
-      <w:pPr>
-        <w:pStyle w:val="BodyText"/>
-      </w:pPr>
-      <w:r>
-        <w:rPr>
-          <w:bCs/>
-          <w:b/>
-        </w:rPr>
-        <w:t xml:space="preserve">Bảng chuyên đề (không đánh số, theo mục):</w:t>
-      </w:r>
-      <w:r>
-        <w:t xml:space="preserve"> </w:t>
-      </w:r>
-      <w:r>
-        <w:t xml:space="preserve">- Bảng định nghĩa biến, Nghiên cứu P3 Việt Nam (Chương 3, Mục 3.4.5.1)</w:t>
-      </w:r>
-      <w:r>
-        <w:t xml:space="preserve"> </w:t>
-      </w:r>
-      <w:r>
-        <w:t xml:space="preserve">- Bảng định nghĩa biến, Nghiên cứu P4 Singapore (Chương 3, Mục 3.4.5.2)</w:t>
-      </w:r>
-      <w:r>
-        <w:t xml:space="preserve"> </w:t>
-      </w:r>
-      <w:r>
-        <w:t xml:space="preserve">- Bảng định nghĩa biến, Nghiên cứu P5 Trung Quốc (Chương 3, Mục 3.4.5.3)</w:t>
-      </w:r>
-      <w:r>
-        <w:t xml:space="preserve"> </w:t>
-      </w:r>
-      <w:r>
-        <w:t xml:space="preserve">- Bảng định nghĩa biến, Nghiên cứu P7 đa quốc gia (Chương 3, Mục 3.4.5.4)</w:t>
-      </w:r>
-      <w:r>
-        <w:t xml:space="preserve"> </w:t>
-      </w:r>
-      <w:r>
-        <w:t xml:space="preserve">- Bảng định nghĩa biến, Nghiên cứu P8 SIDS (Chương 3, Mục 3.4.5.5)</w:t>
-      </w:r>
-      <w:r>
-        <w:t xml:space="preserve"> </w:t>
-      </w:r>
-      <w:r>
-        <w:t xml:space="preserve">- Bảng tóm tắt phương pháp: Kế thừa và đóng góp mới (Chương 3, Mục 3.6)</w:t>
-      </w:r>
-      <w:r>
-        <w:t xml:space="preserve"> </w:t>
-      </w:r>
-      <w:r>
-        <w:t xml:space="preserve">- Bảng tổng hợp kết quả kiểm định hệ giả thuyết H1–H6, H1b, H1c (Chương 4, Mục 4.11)</w:t>
-      </w:r>
-    </w:p>
+    <w:tbl>
+      <w:tblPr>
+        <w:tblStyle w:val="Table"/>
+        <w:tblW w:type="pct" w:w="5000"/>
+        <w:tblLook w:firstRow="1" w:lastRow="0" w:firstColumn="0" w:lastColumn="0" w:noHBand="0" w:noVBand="0" w:val="0020"/>
+        <w:jc w:val="start"/>
+      </w:tblPr>
+      <w:tblGrid>
+        <w:gridCol w:w="621"/>
+        <w:gridCol w:w="6677"/>
+        <w:gridCol w:w="621"/>
+      </w:tblGrid>
+      <w:tr>
+        <w:trPr>
+          <w:tblHeader w:val="true"/>
+        </w:trPr>
+        <w:tc>
+          <w:tcPr/>
+          <w:p>
+            <w:pPr>
+              <w:pStyle w:val="Compact"/>
+              <w:jc w:val="left"/>
+            </w:pPr>
+            <w:r>
+              <w:t xml:space="preserve">Bảng</w:t>
+            </w:r>
+          </w:p>
+        </w:tc>
+        <w:tc>
+          <w:tcPr/>
+          <w:p>
+            <w:pPr>
+              <w:pStyle w:val="Compact"/>
+              <w:jc w:val="left"/>
+            </w:pPr>
+            <w:r>
+              <w:t xml:space="preserve">Nội dung</w:t>
+            </w:r>
+          </w:p>
+        </w:tc>
+        <w:tc>
+          <w:tcPr/>
+          <w:p>
+            <w:pPr>
+              <w:pStyle w:val="Compact"/>
+              <w:jc w:val="right"/>
+            </w:pPr>
+            <w:r>
+              <w:t xml:space="preserve">Trang</w:t>
+            </w:r>
+          </w:p>
+        </w:tc>
+      </w:tr>
+      <w:tr>
+        <w:tc>
+          <w:tcPr/>
+          <w:p>
+            <w:pPr>
+              <w:pStyle w:val="Compact"/>
+              <w:jc w:val="left"/>
+            </w:pPr>
+            <w:r>
+              <w:t xml:space="preserve">2.1</w:t>
+            </w:r>
+          </w:p>
+        </w:tc>
+        <w:tc>
+          <w:tcPr/>
+          <w:p>
+            <w:pPr>
+              <w:pStyle w:val="Compact"/>
+              <w:jc w:val="left"/>
+            </w:pPr>
+            <w:r>
+              <w:t xml:space="preserve">Tổng hợp hệ giả thuyết: phát biểu, dấu kỳ vọng, cơ sở lý thuyết và biến kiểm định</w:t>
+            </w:r>
+          </w:p>
+        </w:tc>
+        <w:tc>
+          <w:tcPr/>
+          <w:p>
+            <w:pPr>
+              <w:pStyle w:val="Compact"/>
+              <w:jc w:val="right"/>
+            </w:pPr>
+            <w:r>
+              <w:t xml:space="preserve">30</w:t>
+            </w:r>
+          </w:p>
+        </w:tc>
+      </w:tr>
+      <w:tr>
+        <w:tc>
+          <w:tcPr/>
+          <w:p>
+            <w:pPr>
+              <w:pStyle w:val="Compact"/>
+              <w:jc w:val="left"/>
+            </w:pPr>
+            <w:r>
+              <w:t xml:space="preserve">2.2</w:t>
+            </w:r>
+          </w:p>
+        </w:tc>
+        <w:tc>
+          <w:tcPr/>
+          <w:p>
+            <w:pPr>
+              <w:pStyle w:val="Compact"/>
+              <w:jc w:val="left"/>
+            </w:pPr>
+            <w:r>
+              <w:t xml:space="preserve">Ánh xạ nghiên cứu thành phần, mục trình bày, giả thuyết</w:t>
+            </w:r>
+          </w:p>
+        </w:tc>
+        <w:tc>
+          <w:tcPr/>
+          <w:p>
+            <w:pPr>
+              <w:pStyle w:val="Compact"/>
+              <w:jc w:val="right"/>
+            </w:pPr>
+            <w:r>
+              <w:t xml:space="preserve">31</w:t>
+            </w:r>
+          </w:p>
+        </w:tc>
+      </w:tr>
+      <w:tr>
+        <w:tc>
+          <w:tcPr/>
+          <w:p>
+            <w:pPr>
+              <w:pStyle w:val="Compact"/>
+              <w:jc w:val="left"/>
+            </w:pPr>
+            <w:r>
+              <w:t xml:space="preserve">3.1</w:t>
+            </w:r>
+          </w:p>
+        </w:tc>
+        <w:tc>
+          <w:tcPr/>
+          <w:p>
+            <w:pPr>
+              <w:pStyle w:val="Compact"/>
+              <w:jc w:val="left"/>
+            </w:pPr>
+            <w:r>
+              <w:t xml:space="preserve">Tổng hợp biến nghiên cứu của khung thực nghiệm đa quốc gia</w:t>
+            </w:r>
+          </w:p>
+        </w:tc>
+        <w:tc>
+          <w:tcPr/>
+          <w:p>
+            <w:pPr>
+              <w:pStyle w:val="Compact"/>
+              <w:jc w:val="right"/>
+            </w:pPr>
+            <w:r>
+              <w:t xml:space="preserve">41</w:t>
+            </w:r>
+          </w:p>
+        </w:tc>
+      </w:tr>
+      <w:tr>
+        <w:tc>
+          <w:tcPr/>
+          <w:p>
+            <w:pPr>
+              <w:pStyle w:val="Compact"/>
+              <w:jc w:val="left"/>
+            </w:pPr>
+            <w:r>
+              <w:t xml:space="preserve">4.1</w:t>
+            </w:r>
+          </w:p>
+        </w:tc>
+        <w:tc>
+          <w:tcPr/>
+          <w:p>
+            <w:pPr>
+              <w:pStyle w:val="Compact"/>
+              <w:jc w:val="left"/>
+            </w:pPr>
+            <w:r>
+              <w:t xml:space="preserve">Phân tán năng suất lao động và đặc điểm quốc tế hóa theo phân nhóm con ICRV</w:t>
+            </w:r>
+          </w:p>
+        </w:tc>
+        <w:tc>
+          <w:tcPr/>
+          <w:p>
+            <w:pPr>
+              <w:pStyle w:val="Compact"/>
+              <w:jc w:val="right"/>
+            </w:pPr>
+            <w:r>
+              <w:t xml:space="preserve">64</w:t>
+            </w:r>
+          </w:p>
+        </w:tc>
+      </w:tr>
+      <w:tr>
+        <w:tc>
+          <w:tcPr/>
+          <w:p>
+            <w:pPr>
+              <w:pStyle w:val="Compact"/>
+              <w:jc w:val="left"/>
+            </w:pPr>
+            <w:r>
+              <w:t xml:space="preserve">4.2</w:t>
+            </w:r>
+          </w:p>
+        </w:tc>
+        <w:tc>
+          <w:tcPr/>
+          <w:p>
+            <w:pPr>
+              <w:pStyle w:val="Compact"/>
+              <w:jc w:val="left"/>
+            </w:pPr>
+            <w:r>
+              <w:t xml:space="preserve">Đổi mới sáng tạo và chấp nhận số theo phân nhóm con ICRV (%)</w:t>
+            </w:r>
+          </w:p>
+        </w:tc>
+        <w:tc>
+          <w:tcPr/>
+          <w:p>
+            <w:pPr>
+              <w:pStyle w:val="Compact"/>
+              <w:jc w:val="right"/>
+            </w:pPr>
+            <w:r>
+              <w:t xml:space="preserve">67</w:t>
+            </w:r>
+          </w:p>
+        </w:tc>
+      </w:tr>
+      <w:tr>
+        <w:tc>
+          <w:tcPr/>
+          <w:p>
+            <w:pPr>
+              <w:pStyle w:val="Compact"/>
+              <w:jc w:val="left"/>
+            </w:pPr>
+            <w:r>
+              <w:t xml:space="preserve">4.3</w:t>
+            </w:r>
+          </w:p>
+        </w:tc>
+        <w:tc>
+          <w:tcPr/>
+          <w:p>
+            <w:pPr>
+              <w:pStyle w:val="Compact"/>
+              <w:jc w:val="left"/>
+            </w:pPr>
+            <w:r>
+              <w:t xml:space="preserve">Đặc trưng doanh nghiệp Nhật Bản 2025 so với năm nền còn lại của Nhóm I</w:t>
+            </w:r>
+          </w:p>
+        </w:tc>
+        <w:tc>
+          <w:tcPr/>
+          <w:p>
+            <w:pPr>
+              <w:pStyle w:val="Compact"/>
+              <w:jc w:val="right"/>
+            </w:pPr>
+            <w:r>
+              <w:t xml:space="preserve">68</w:t>
+            </w:r>
+          </w:p>
+        </w:tc>
+      </w:tr>
+      <w:tr>
+        <w:tc>
+          <w:tcPr/>
+          <w:p>
+            <w:pPr>
+              <w:pStyle w:val="Compact"/>
+              <w:jc w:val="left"/>
+            </w:pPr>
+            <w:r>
+              <w:t xml:space="preserve">4.4</w:t>
+            </w:r>
+          </w:p>
+        </w:tc>
+        <w:tc>
+          <w:tcPr/>
+          <w:p>
+            <w:pPr>
+              <w:pStyle w:val="Compact"/>
+              <w:jc w:val="left"/>
+            </w:pPr>
+            <w:r>
+              <w:t xml:space="preserve">Trung vị tỷ suất lợi nhuận trên doanh thu (ROS) theo nhóm ICRV</w:t>
+            </w:r>
+          </w:p>
+        </w:tc>
+        <w:tc>
+          <w:tcPr/>
+          <w:p>
+            <w:pPr>
+              <w:pStyle w:val="Compact"/>
+              <w:jc w:val="right"/>
+            </w:pPr>
+            <w:r>
+              <w:t xml:space="preserve">71</w:t>
+            </w:r>
+          </w:p>
+        </w:tc>
+      </w:tr>
+      <w:tr>
+        <w:tc>
+          <w:tcPr/>
+          <w:p>
+            <w:pPr>
+              <w:pStyle w:val="Compact"/>
+              <w:jc w:val="left"/>
+            </w:pPr>
+            <w:r>
+              <w:t xml:space="preserve">4.5</w:t>
+            </w:r>
+          </w:p>
+        </w:tc>
+        <w:tc>
+          <w:tcPr/>
+          <w:p>
+            <w:pPr>
+              <w:pStyle w:val="Compact"/>
+              <w:jc w:val="left"/>
+            </w:pPr>
+            <w:r>
+              <w:t xml:space="preserve">Tiến triển hệ số theo chuỗi mô hình phân tầng, Singapore 2023</w:t>
+            </w:r>
+          </w:p>
+        </w:tc>
+        <w:tc>
+          <w:tcPr/>
+          <w:p>
+            <w:pPr>
+              <w:pStyle w:val="Compact"/>
+              <w:jc w:val="right"/>
+            </w:pPr>
+            <w:r>
+              <w:t xml:space="preserve">77</w:t>
+            </w:r>
+          </w:p>
+        </w:tc>
+      </w:tr>
+      <w:tr>
+        <w:tc>
+          <w:tcPr/>
+          <w:p>
+            <w:pPr>
+              <w:pStyle w:val="Compact"/>
+              <w:jc w:val="left"/>
+            </w:pPr>
+            <w:r>
+              <w:t xml:space="preserve">4.6</w:t>
+            </w:r>
+          </w:p>
+        </w:tc>
+        <w:tc>
+          <w:tcPr/>
+          <w:p>
+            <w:pPr>
+              <w:pStyle w:val="Compact"/>
+              <w:jc w:val="left"/>
+            </w:pPr>
+            <w:r>
+              <w:t xml:space="preserve">Tiến triển mô hình của P7 trên khung 50 nền: điểm uốn và kiểm định Lind–Mehlum</w:t>
+            </w:r>
+          </w:p>
+        </w:tc>
+        <w:tc>
+          <w:tcPr/>
+          <w:p>
+            <w:pPr>
+              <w:pStyle w:val="Compact"/>
+              <w:jc w:val="right"/>
+            </w:pPr>
+            <w:r>
+              <w:t xml:space="preserve">84</w:t>
+            </w:r>
+          </w:p>
+        </w:tc>
+      </w:tr>
+      <w:tr>
+        <w:tc>
+          <w:tcPr/>
+          <w:p>
+            <w:pPr>
+              <w:pStyle w:val="Compact"/>
+              <w:jc w:val="left"/>
+            </w:pPr>
+            <w:r>
+              <w:t xml:space="preserve">4.7</w:t>
+            </w:r>
+          </w:p>
+        </w:tc>
+        <w:tc>
+          <w:tcPr/>
+          <w:p>
+            <w:pPr>
+              <w:pStyle w:val="Compact"/>
+              <w:jc w:val="left"/>
+            </w:pPr>
+            <w:r>
+              <w:t xml:space="preserve">Điểm uốn theo nhóm ICRV, khung 50 nền</w:t>
+            </w:r>
+          </w:p>
+        </w:tc>
+        <w:tc>
+          <w:tcPr/>
+          <w:p>
+            <w:pPr>
+              <w:pStyle w:val="Compact"/>
+              <w:jc w:val="right"/>
+            </w:pPr>
+            <w:r>
+              <w:t xml:space="preserve">84</w:t>
+            </w:r>
+          </w:p>
+        </w:tc>
+      </w:tr>
+      <w:tr>
+        <w:tc>
+          <w:tcPr/>
+          <w:p>
+            <w:pPr>
+              <w:pStyle w:val="Compact"/>
+              <w:jc w:val="left"/>
+            </w:pPr>
+            <w:r>
+              <w:t xml:space="preserve">4.8</w:t>
+            </w:r>
+          </w:p>
+        </w:tc>
+        <w:tc>
+          <w:tcPr/>
+          <w:p>
+            <w:pPr>
+              <w:pStyle w:val="Compact"/>
+              <w:jc w:val="left"/>
+            </w:pPr>
+            <w:r>
+              <w:t xml:space="preserve">Điểm uốn theo đợt khảo sát, Ấn Độ</w:t>
+            </w:r>
+          </w:p>
+        </w:tc>
+        <w:tc>
+          <w:tcPr/>
+          <w:p>
+            <w:pPr>
+              <w:pStyle w:val="Compact"/>
+              <w:jc w:val="right"/>
+            </w:pPr>
+            <w:r>
+              <w:t xml:space="preserve">92</w:t>
+            </w:r>
+          </w:p>
+        </w:tc>
+      </w:tr>
+      <w:tr>
+        <w:tc>
+          <w:tcPr/>
+          <w:p>
+            <w:pPr>
+              <w:pStyle w:val="Compact"/>
+              <w:jc w:val="left"/>
+            </w:pPr>
+            <w:r>
+              <w:t xml:space="preserve">4.9</w:t>
+            </w:r>
+          </w:p>
+        </w:tc>
+        <w:tc>
+          <w:tcPr/>
+          <w:p>
+            <w:pPr>
+              <w:pStyle w:val="Compact"/>
+              <w:jc w:val="left"/>
+            </w:pPr>
+            <w:r>
+              <w:t xml:space="preserve">Hiệu ứng cường độ xuất khẩu lên năng suất qua chuỗi mô hình, Nhật Bản 2025</w:t>
+            </w:r>
+          </w:p>
+        </w:tc>
+        <w:tc>
+          <w:tcPr/>
+          <w:p>
+            <w:pPr>
+              <w:pStyle w:val="Compact"/>
+              <w:jc w:val="right"/>
+            </w:pPr>
+            <w:r>
+              <w:t xml:space="preserve">96</w:t>
+            </w:r>
+          </w:p>
+        </w:tc>
+      </w:tr>
+      <w:tr>
+        <w:tc>
+          <w:tcPr/>
+          <w:p>
+            <w:pPr>
+              <w:pStyle w:val="Compact"/>
+              <w:jc w:val="left"/>
+            </w:pPr>
+            <w:r>
+              <w:t xml:space="preserve">4.10</w:t>
+            </w:r>
+          </w:p>
+        </w:tc>
+        <w:tc>
+          <w:tcPr/>
+          <w:p>
+            <w:pPr>
+              <w:pStyle w:val="Compact"/>
+              <w:jc w:val="left"/>
+            </w:pPr>
+            <w:r>
+              <w:t xml:space="preserve">Tổng hợp ước lượng các nghiên cứu thành phần thực nghiệm</w:t>
+            </w:r>
+          </w:p>
+        </w:tc>
+        <w:tc>
+          <w:tcPr/>
+          <w:p>
+            <w:pPr>
+              <w:pStyle w:val="Compact"/>
+              <w:jc w:val="right"/>
+            </w:pPr>
+            <w:r>
+              <w:t xml:space="preserve">98</w:t>
+            </w:r>
+          </w:p>
+        </w:tc>
+      </w:tr>
+      <w:tr>
+        <w:tc>
+          <w:tcPr/>
+          <w:p>
+            <w:pPr>
+              <w:pStyle w:val="Compact"/>
+              <w:jc w:val="left"/>
+            </w:pPr>
+            <w:r>
+              <w:t xml:space="preserve">5.1</w:t>
+            </w:r>
+          </w:p>
+        </w:tc>
+        <w:tc>
+          <w:tcPr/>
+          <w:p>
+            <w:pPr>
+              <w:pStyle w:val="Compact"/>
+              <w:jc w:val="left"/>
+            </w:pPr>
+            <w:r>
+              <w:t xml:space="preserve">Sợi chỉ vàng tích hợp: câu hỏi nghiên cứu, nghiên cứu thành phần, giả thuyết, phát hiện thực nghiệm chủ chốt, đóng góp lý thuyết</w:t>
+            </w:r>
+          </w:p>
+        </w:tc>
+        <w:tc>
+          <w:tcPr/>
+          <w:p>
+            <w:pPr>
+              <w:pStyle w:val="Compact"/>
+              <w:jc w:val="right"/>
+            </w:pPr>
+            <w:r>
+              <w:t xml:space="preserve">106</w:t>
+            </w:r>
+          </w:p>
+        </w:tc>
+      </w:tr>
+      <w:tr>
+        <w:tc>
+          <w:tcPr/>
+          <w:p>
+            <w:pPr>
+              <w:pStyle w:val="Compact"/>
+              <w:jc w:val="left"/>
+            </w:pPr>
+            <w:r>
+              <w:t xml:space="preserve">C.1</w:t>
+            </w:r>
+          </w:p>
+        </w:tc>
+        <w:tc>
+          <w:tcPr/>
+          <w:p>
+            <w:pPr>
+              <w:pStyle w:val="Compact"/>
+              <w:jc w:val="left"/>
+            </w:pPr>
+            <w:r>
+              <w:t xml:space="preserve">Kết quả hồi quy chính và điểm uốn của tám nghiên cứu thành phần</w:t>
+            </w:r>
+          </w:p>
+        </w:tc>
+        <w:tc>
+          <w:tcPr/>
+          <w:p>
+            <w:pPr>
+              <w:pStyle w:val="Compact"/>
+              <w:jc w:val="right"/>
+            </w:pPr>
+            <w:r>
+              <w:t xml:space="preserve">149</w:t>
+            </w:r>
+          </w:p>
+        </w:tc>
+      </w:tr>
+      <w:tr>
+        <w:tc>
+          <w:tcPr/>
+          <w:p>
+            <w:pPr>
+              <w:pStyle w:val="Compact"/>
+              <w:jc w:val="left"/>
+            </w:pPr>
+            <w:r>
+              <w:t xml:space="preserve">C.2</w:t>
+            </w:r>
+          </w:p>
+        </w:tc>
+        <w:tc>
+          <w:tcPr/>
+          <w:p>
+            <w:pPr>
+              <w:pStyle w:val="Compact"/>
+              <w:jc w:val="left"/>
+            </w:pPr>
+            <w:r>
+              <w:t xml:space="preserve">Chi tiết phân tích tổng hợp ba tầng P6</w:t>
+            </w:r>
+          </w:p>
+        </w:tc>
+        <w:tc>
+          <w:tcPr/>
+          <w:p>
+            <w:pPr>
+              <w:pStyle w:val="Compact"/>
+              <w:jc w:val="right"/>
+            </w:pPr>
+            <w:r>
+              <w:t xml:space="preserve">150</w:t>
+            </w:r>
+          </w:p>
+        </w:tc>
+      </w:tr>
+      <w:tr>
+        <w:tc>
+          <w:tcPr/>
+          <w:p>
+            <w:pPr>
+              <w:pStyle w:val="Compact"/>
+              <w:jc w:val="left"/>
+            </w:pPr>
+            <w:r>
+              <w:t xml:space="preserve">C.3</w:t>
+            </w:r>
+          </w:p>
+        </w:tc>
+        <w:tc>
+          <w:tcPr/>
+          <w:p>
+            <w:pPr>
+              <w:pStyle w:val="Compact"/>
+              <w:jc w:val="left"/>
+            </w:pPr>
+            <w:r>
+              <w:t xml:space="preserve">Điểm uốn theo sáu nhóm ICRV trong kiểm định toàn mẫu P7</w:t>
+            </w:r>
+          </w:p>
+        </w:tc>
+        <w:tc>
+          <w:tcPr/>
+          <w:p>
+            <w:pPr>
+              <w:pStyle w:val="Compact"/>
+              <w:jc w:val="right"/>
+            </w:pPr>
+            <w:r>
+              <w:t xml:space="preserve">150</w:t>
+            </w:r>
+          </w:p>
+        </w:tc>
+      </w:tr>
+      <w:tr>
+        <w:tc>
+          <w:tcPr/>
+          <w:p>
+            <w:pPr>
+              <w:pStyle w:val="Compact"/>
+              <w:jc w:val="left"/>
+            </w:pPr>
+            <w:r>
+              <w:t xml:space="preserve">C.4</w:t>
+            </w:r>
+          </w:p>
+        </w:tc>
+        <w:tc>
+          <w:tcPr/>
+          <w:p>
+            <w:pPr>
+              <w:pStyle w:val="Compact"/>
+              <w:jc w:val="left"/>
+            </w:pPr>
+            <w:r>
+              <w:t xml:space="preserve">Tóm tắt kiểm định độ vững theo từng nghiên cứu thành phần</w:t>
+            </w:r>
+          </w:p>
+        </w:tc>
+        <w:tc>
+          <w:tcPr/>
+          <w:p>
+            <w:pPr>
+              <w:pStyle w:val="Compact"/>
+              <w:jc w:val="right"/>
+            </w:pPr>
+            <w:r>
+              <w:t xml:space="preserve">151</w:t>
+            </w:r>
+          </w:p>
+        </w:tc>
+      </w:tr>
+    </w:tbl>
     <w:bookmarkEnd w:id="24"/>
     <w:bookmarkStart w:id="25" w:name="danh-mục-hình"/>
     <w:p>
@@ -634,126 +1186,440 @@
         <w:t xml:space="preserve">DANH MỤC HÌNH</w:t>
       </w:r>
     </w:p>
-    <w:p>
-      <w:pPr>
-        <w:numPr>
-          <w:ilvl w:val="0"/>
-          <w:numId w:val="1001"/>
-        </w:numPr>
-        <w:pStyle w:val="Compact"/>
-      </w:pPr>
-      <w:r>
-        <w:t xml:space="preserve">Hình 2.1. Khung khái niệm tích hợp đa tầng CDCM (Chương 2, Mục 2.5)</w:t>
-      </w:r>
-    </w:p>
-    <w:p>
-      <w:pPr>
-        <w:numPr>
-          <w:ilvl w:val="0"/>
-          <w:numId w:val="1001"/>
-        </w:numPr>
-        <w:pStyle w:val="Compact"/>
-      </w:pPr>
-      <w:r>
-        <w:t xml:space="preserve">Hình 3.1. Quy trình nghiên cứu của luận án (Chương 3, Mục 3.1.2)</w:t>
-      </w:r>
-    </w:p>
-    <w:p>
-      <w:pPr>
-        <w:numPr>
-          <w:ilvl w:val="0"/>
-          <w:numId w:val="1001"/>
-        </w:numPr>
-        <w:pStyle w:val="Compact"/>
-      </w:pPr>
-      <w:r>
-        <w:t xml:space="preserve">Hình 4.1. Thành phần mẫu gộp theo nhóm ICRV (Chương 4, Mục 4.1)</w:t>
-      </w:r>
-    </w:p>
-    <w:p>
-      <w:pPr>
-        <w:numPr>
-          <w:ilvl w:val="0"/>
-          <w:numId w:val="1001"/>
-        </w:numPr>
-        <w:pStyle w:val="Compact"/>
-      </w:pPr>
-      <w:r>
-        <w:t xml:space="preserve">Hình 4.2. Quy mô mẫu gộp theo năm khảo sát (Chương 4, Mục 4.1)</w:t>
-      </w:r>
-    </w:p>
-    <w:p>
-      <w:pPr>
-        <w:numPr>
-          <w:ilvl w:val="0"/>
-          <w:numId w:val="1001"/>
-        </w:numPr>
-        <w:pStyle w:val="Compact"/>
-      </w:pPr>
-      <w:r>
-        <w:t xml:space="preserve">Hình 4.3. Quỹ đạo tăng trưởng theo nhóm ICRV (Chương 4, Mục 4.1)</w:t>
-      </w:r>
-    </w:p>
-    <w:p>
-      <w:pPr>
-        <w:numPr>
-          <w:ilvl w:val="0"/>
-          <w:numId w:val="1001"/>
-        </w:numPr>
-        <w:pStyle w:val="Compact"/>
-      </w:pPr>
-      <w:r>
-        <w:t xml:space="preserve">Hình 4.4. Phân bố quy mô doanh nghiệp theo nhóm ICRV (Chương 4, Mục 4.1)</w:t>
-      </w:r>
-    </w:p>
-    <w:p>
-      <w:pPr>
-        <w:numPr>
-          <w:ilvl w:val="0"/>
-          <w:numId w:val="1001"/>
-        </w:numPr>
-        <w:pStyle w:val="Compact"/>
-      </w:pPr>
-      <w:r>
-        <w:t xml:space="preserve">Hình 4.5. Phổ năng lực công nghệ theo sáu nhóm ICRV (Chương 4, Mục 4.1)</w:t>
-      </w:r>
-    </w:p>
-    <w:p>
-      <w:pPr>
-        <w:numPr>
-          <w:ilvl w:val="0"/>
-          <w:numId w:val="1001"/>
-        </w:numPr>
-        <w:pStyle w:val="Compact"/>
-      </w:pPr>
-      <w:r>
-        <w:t xml:space="preserve">Hình 4.6. Phân bố mật độ năng suất lao động theo nhóm ICRV (Chương 4, Mục 4.1)</w:t>
-      </w:r>
-    </w:p>
-    <w:p>
-      <w:pPr>
-        <w:numPr>
-          <w:ilvl w:val="0"/>
-          <w:numId w:val="1001"/>
-        </w:numPr>
-        <w:pStyle w:val="Compact"/>
-      </w:pPr>
-      <w:r>
-        <w:t xml:space="preserve">Hình 4.7. Biểu đồ radar năng lực và quốc tế hóa theo nhóm ICRV (Chương 4, Mục 4.1)</w:t>
-      </w:r>
-    </w:p>
-    <w:p>
-      <w:pPr>
-        <w:numPr>
-          <w:ilvl w:val="0"/>
-          <w:numId w:val="1001"/>
-        </w:numPr>
-        <w:pStyle w:val="Compact"/>
-      </w:pPr>
-      <w:r>
-        <w:t xml:space="preserve">Hình 4.8. Họ đường cong quốc tế hóa và hiệu quả phụ thuộc chế độ thể chế ICRV (Chương 4, Mục 4.6.2)</w:t>
-      </w:r>
-    </w:p>
+    <w:tbl>
+      <w:tblPr>
+        <w:tblStyle w:val="Table"/>
+        <w:tblW w:type="pct" w:w="5000"/>
+        <w:tblLook w:firstRow="1" w:lastRow="0" w:firstColumn="0" w:lastColumn="0" w:noHBand="0" w:noVBand="0" w:val="0020"/>
+        <w:jc w:val="start"/>
+      </w:tblPr>
+      <w:tblGrid>
+        <w:gridCol w:w="621"/>
+        <w:gridCol w:w="6677"/>
+        <w:gridCol w:w="621"/>
+      </w:tblGrid>
+      <w:tr>
+        <w:trPr>
+          <w:tblHeader w:val="true"/>
+        </w:trPr>
+        <w:tc>
+          <w:tcPr/>
+          <w:p>
+            <w:pPr>
+              <w:pStyle w:val="Compact"/>
+              <w:jc w:val="left"/>
+            </w:pPr>
+            <w:r>
+              <w:t xml:space="preserve">Hình</w:t>
+            </w:r>
+          </w:p>
+        </w:tc>
+        <w:tc>
+          <w:tcPr/>
+          <w:p>
+            <w:pPr>
+              <w:pStyle w:val="Compact"/>
+              <w:jc w:val="left"/>
+            </w:pPr>
+            <w:r>
+              <w:t xml:space="preserve">Nội dung</w:t>
+            </w:r>
+          </w:p>
+        </w:tc>
+        <w:tc>
+          <w:tcPr/>
+          <w:p>
+            <w:pPr>
+              <w:pStyle w:val="Compact"/>
+              <w:jc w:val="right"/>
+            </w:pPr>
+            <w:r>
+              <w:t xml:space="preserve">Trang</w:t>
+            </w:r>
+          </w:p>
+        </w:tc>
+      </w:tr>
+      <w:tr>
+        <w:tc>
+          <w:tcPr/>
+          <w:p>
+            <w:pPr>
+              <w:pStyle w:val="Compact"/>
+              <w:jc w:val="left"/>
+            </w:pPr>
+            <w:r>
+              <w:t xml:space="preserve">2.1</w:t>
+            </w:r>
+          </w:p>
+        </w:tc>
+        <w:tc>
+          <w:tcPr/>
+          <w:p>
+            <w:pPr>
+              <w:pStyle w:val="Compact"/>
+              <w:jc w:val="left"/>
+            </w:pPr>
+            <w:r>
+              <w:t xml:space="preserve">Khung khái niệm tích hợp đa tầng CDCM</w:t>
+            </w:r>
+          </w:p>
+        </w:tc>
+        <w:tc>
+          <w:tcPr/>
+          <w:p>
+            <w:pPr>
+              <w:pStyle w:val="Compact"/>
+              <w:jc w:val="right"/>
+            </w:pPr>
+            <w:r>
+              <w:t xml:space="preserve">26</w:t>
+            </w:r>
+          </w:p>
+        </w:tc>
+      </w:tr>
+      <w:tr>
+        <w:tc>
+          <w:tcPr/>
+          <w:p>
+            <w:pPr>
+              <w:pStyle w:val="Compact"/>
+              <w:jc w:val="left"/>
+            </w:pPr>
+            <w:r>
+              <w:t xml:space="preserve">3.1</w:t>
+            </w:r>
+          </w:p>
+        </w:tc>
+        <w:tc>
+          <w:tcPr/>
+          <w:p>
+            <w:pPr>
+              <w:pStyle w:val="Compact"/>
+              <w:jc w:val="left"/>
+            </w:pPr>
+            <w:r>
+              <w:t xml:space="preserve">Quy trình nghiên cứu của luận án</w:t>
+            </w:r>
+          </w:p>
+        </w:tc>
+        <w:tc>
+          <w:tcPr/>
+          <w:p>
+            <w:pPr>
+              <w:pStyle w:val="Compact"/>
+              <w:jc w:val="right"/>
+            </w:pPr>
+            <w:r>
+              <w:t xml:space="preserve">34</w:t>
+            </w:r>
+          </w:p>
+        </w:tc>
+      </w:tr>
+      <w:tr>
+        <w:tc>
+          <w:tcPr/>
+          <w:p>
+            <w:pPr>
+              <w:pStyle w:val="Compact"/>
+              <w:jc w:val="left"/>
+            </w:pPr>
+            <w:r>
+              <w:t xml:space="preserve">4.1</w:t>
+            </w:r>
+          </w:p>
+        </w:tc>
+        <w:tc>
+          <w:tcPr/>
+          <w:p>
+            <w:pPr>
+              <w:pStyle w:val="Compact"/>
+              <w:jc w:val="left"/>
+            </w:pPr>
+            <w:r>
+              <w:t xml:space="preserve">Thành phần mẫu gộp theo nhóm ICRV</w:t>
+            </w:r>
+          </w:p>
+        </w:tc>
+        <w:tc>
+          <w:tcPr/>
+          <w:p>
+            <w:pPr>
+              <w:pStyle w:val="Compact"/>
+              <w:jc w:val="right"/>
+            </w:pPr>
+            <w:r>
+              <w:t xml:space="preserve">65</w:t>
+            </w:r>
+          </w:p>
+        </w:tc>
+      </w:tr>
+      <w:tr>
+        <w:tc>
+          <w:tcPr/>
+          <w:p>
+            <w:pPr>
+              <w:pStyle w:val="Compact"/>
+              <w:jc w:val="left"/>
+            </w:pPr>
+            <w:r>
+              <w:t xml:space="preserve">4.2</w:t>
+            </w:r>
+          </w:p>
+        </w:tc>
+        <w:tc>
+          <w:tcPr/>
+          <w:p>
+            <w:pPr>
+              <w:pStyle w:val="Compact"/>
+              <w:jc w:val="left"/>
+            </w:pPr>
+            <w:r>
+              <w:t xml:space="preserve">Quy mô mẫu gộp theo năm khảo sát</w:t>
+            </w:r>
+          </w:p>
+        </w:tc>
+        <w:tc>
+          <w:tcPr/>
+          <w:p>
+            <w:pPr>
+              <w:pStyle w:val="Compact"/>
+              <w:jc w:val="right"/>
+            </w:pPr>
+            <w:r>
+              <w:t xml:space="preserve">66</w:t>
+            </w:r>
+          </w:p>
+        </w:tc>
+      </w:tr>
+      <w:tr>
+        <w:tc>
+          <w:tcPr/>
+          <w:p>
+            <w:pPr>
+              <w:pStyle w:val="Compact"/>
+              <w:jc w:val="left"/>
+            </w:pPr>
+            <w:r>
+              <w:t xml:space="preserve">4.3</w:t>
+            </w:r>
+          </w:p>
+        </w:tc>
+        <w:tc>
+          <w:tcPr/>
+          <w:p>
+            <w:pPr>
+              <w:pStyle w:val="Compact"/>
+              <w:jc w:val="left"/>
+            </w:pPr>
+            <w:r>
+              <w:t xml:space="preserve">Quỹ đạo tăng trưởng theo nhóm ICRV</w:t>
+            </w:r>
+          </w:p>
+        </w:tc>
+        <w:tc>
+          <w:tcPr/>
+          <w:p>
+            <w:pPr>
+              <w:pStyle w:val="Compact"/>
+              <w:jc w:val="right"/>
+            </w:pPr>
+            <w:r>
+              <w:t xml:space="preserve">66</w:t>
+            </w:r>
+          </w:p>
+        </w:tc>
+      </w:tr>
+      <w:tr>
+        <w:tc>
+          <w:tcPr/>
+          <w:p>
+            <w:pPr>
+              <w:pStyle w:val="Compact"/>
+              <w:jc w:val="left"/>
+            </w:pPr>
+            <w:r>
+              <w:t xml:space="preserve">4.4</w:t>
+            </w:r>
+          </w:p>
+        </w:tc>
+        <w:tc>
+          <w:tcPr/>
+          <w:p>
+            <w:pPr>
+              <w:pStyle w:val="Compact"/>
+              <w:jc w:val="left"/>
+            </w:pPr>
+            <w:r>
+              <w:t xml:space="preserve">Phân bố quy mô doanh nghiệp theo nhóm ICRV</w:t>
+            </w:r>
+          </w:p>
+        </w:tc>
+        <w:tc>
+          <w:tcPr/>
+          <w:p>
+            <w:pPr>
+              <w:pStyle w:val="Compact"/>
+              <w:jc w:val="right"/>
+            </w:pPr>
+            <w:r>
+              <w:t xml:space="preserve">68</w:t>
+            </w:r>
+          </w:p>
+        </w:tc>
+      </w:tr>
+      <w:tr>
+        <w:tc>
+          <w:tcPr/>
+          <w:p>
+            <w:pPr>
+              <w:pStyle w:val="Compact"/>
+              <w:jc w:val="left"/>
+            </w:pPr>
+            <w:r>
+              <w:t xml:space="preserve">4.5</w:t>
+            </w:r>
+          </w:p>
+        </w:tc>
+        <w:tc>
+          <w:tcPr/>
+          <w:p>
+            <w:pPr>
+              <w:pStyle w:val="Compact"/>
+              <w:jc w:val="left"/>
+            </w:pPr>
+            <w:r>
+              <w:t xml:space="preserve">Phổ năng lực công nghệ theo sáu nhóm ICRV</w:t>
+            </w:r>
+          </w:p>
+        </w:tc>
+        <w:tc>
+          <w:tcPr/>
+          <w:p>
+            <w:pPr>
+              <w:pStyle w:val="Compact"/>
+              <w:jc w:val="right"/>
+            </w:pPr>
+            <w:r>
+              <w:t xml:space="preserve">69</w:t>
+            </w:r>
+          </w:p>
+        </w:tc>
+      </w:tr>
+      <w:tr>
+        <w:tc>
+          <w:tcPr/>
+          <w:p>
+            <w:pPr>
+              <w:pStyle w:val="Compact"/>
+              <w:jc w:val="left"/>
+            </w:pPr>
+            <w:r>
+              <w:t xml:space="preserve">4.6</w:t>
+            </w:r>
+          </w:p>
+        </w:tc>
+        <w:tc>
+          <w:tcPr/>
+          <w:p>
+            <w:pPr>
+              <w:pStyle w:val="Compact"/>
+              <w:jc w:val="left"/>
+            </w:pPr>
+            <w:r>
+              <w:t xml:space="preserve">Phân bố mật độ năng suất lao động theo nhóm ICRV</w:t>
+            </w:r>
+          </w:p>
+        </w:tc>
+        <w:tc>
+          <w:tcPr/>
+          <w:p>
+            <w:pPr>
+              <w:pStyle w:val="Compact"/>
+              <w:jc w:val="right"/>
+            </w:pPr>
+            <w:r>
+              <w:t xml:space="preserve">70</w:t>
+            </w:r>
+          </w:p>
+        </w:tc>
+      </w:tr>
+      <w:tr>
+        <w:tc>
+          <w:tcPr/>
+          <w:p>
+            <w:pPr>
+              <w:pStyle w:val="Compact"/>
+              <w:jc w:val="left"/>
+            </w:pPr>
+            <w:r>
+              <w:t xml:space="preserve">4.7</w:t>
+            </w:r>
+          </w:p>
+        </w:tc>
+        <w:tc>
+          <w:tcPr/>
+          <w:p>
+            <w:pPr>
+              <w:pStyle w:val="Compact"/>
+              <w:jc w:val="left"/>
+            </w:pPr>
+            <w:r>
+              <w:t xml:space="preserve">Biểu đồ radar năng lực và quốc tế hóa theo nhóm ICRV</w:t>
+            </w:r>
+          </w:p>
+        </w:tc>
+        <w:tc>
+          <w:tcPr/>
+          <w:p>
+            <w:pPr>
+              <w:pStyle w:val="Compact"/>
+              <w:jc w:val="right"/>
+            </w:pPr>
+            <w:r>
+              <w:t xml:space="preserve">70</w:t>
+            </w:r>
+          </w:p>
+        </w:tc>
+      </w:tr>
+      <w:tr>
+        <w:tc>
+          <w:tcPr/>
+          <w:p>
+            <w:pPr>
+              <w:pStyle w:val="Compact"/>
+              <w:jc w:val="left"/>
+            </w:pPr>
+            <w:r>
+              <w:t xml:space="preserve">4.8</w:t>
+            </w:r>
+          </w:p>
+        </w:tc>
+        <w:tc>
+          <w:tcPr/>
+          <w:p>
+            <w:pPr>
+              <w:pStyle w:val="Compact"/>
+              <w:jc w:val="left"/>
+            </w:pPr>
+            <w:r>
+              <w:t xml:space="preserve">Họ đường cong quốc tế hóa và hiệu quả phụ thuộc chế độ thể chế ICRV</w:t>
+            </w:r>
+          </w:p>
+        </w:tc>
+        <w:tc>
+          <w:tcPr/>
+          <w:p>
+            <w:pPr>
+              <w:pStyle w:val="Compact"/>
+              <w:jc w:val="right"/>
+            </w:pPr>
+            <w:r>
+              <w:t xml:space="preserve">86</w:t>
+            </w:r>
+          </w:p>
+        </w:tc>
+      </w:tr>
+    </w:tbl>
     <w:bookmarkEnd w:id="25"/>
     <w:bookmarkStart w:id="26" w:name="danh-mục-từ-viết-tắt"/>
     <w:p>
@@ -2148,7 +3014,7 @@
       <w:pPr>
         <w:numPr>
           <w:ilvl w:val="0"/>
-          <w:numId w:val="1002"/>
+          <w:numId w:val="1001"/>
         </w:numPr>
         <w:pStyle w:val="Compact"/>
       </w:pPr>
@@ -2183,7 +3049,7 @@
       <w:pPr>
         <w:numPr>
           <w:ilvl w:val="0"/>
-          <w:numId w:val="1002"/>
+          <w:numId w:val="1001"/>
         </w:numPr>
         <w:pStyle w:val="Compact"/>
       </w:pPr>
@@ -2230,7 +3096,7 @@
       <w:pPr>
         <w:numPr>
           <w:ilvl w:val="0"/>
-          <w:numId w:val="1003"/>
+          <w:numId w:val="1002"/>
         </w:numPr>
         <w:pStyle w:val="Compact"/>
       </w:pPr>
@@ -2265,7 +3131,7 @@
       <w:pPr>
         <w:numPr>
           <w:ilvl w:val="0"/>
-          <w:numId w:val="1003"/>
+          <w:numId w:val="1002"/>
         </w:numPr>
         <w:pStyle w:val="Compact"/>
       </w:pPr>
@@ -2312,7 +3178,7 @@
       <w:pPr>
         <w:numPr>
           <w:ilvl w:val="0"/>
-          <w:numId w:val="1004"/>
+          <w:numId w:val="1003"/>
         </w:numPr>
         <w:pStyle w:val="Compact"/>
       </w:pPr>
@@ -2334,7 +3200,7 @@
       <w:pPr>
         <w:numPr>
           <w:ilvl w:val="0"/>
-          <w:numId w:val="1004"/>
+          <w:numId w:val="1003"/>
         </w:numPr>
         <w:pStyle w:val="Compact"/>
       </w:pPr>
@@ -2356,7 +3222,7 @@
       <w:pPr>
         <w:numPr>
           <w:ilvl w:val="0"/>
-          <w:numId w:val="1004"/>
+          <w:numId w:val="1003"/>
         </w:numPr>
         <w:pStyle w:val="Compact"/>
       </w:pPr>
@@ -2378,7 +3244,7 @@
       <w:pPr>
         <w:numPr>
           <w:ilvl w:val="0"/>
-          <w:numId w:val="1004"/>
+          <w:numId w:val="1003"/>
         </w:numPr>
         <w:pStyle w:val="Compact"/>
       </w:pPr>
@@ -2400,7 +3266,7 @@
       <w:pPr>
         <w:numPr>
           <w:ilvl w:val="0"/>
-          <w:numId w:val="1004"/>
+          <w:numId w:val="1003"/>
         </w:numPr>
         <w:pStyle w:val="Compact"/>
       </w:pPr>
@@ -2422,7 +3288,7 @@
       <w:pPr>
         <w:numPr>
           <w:ilvl w:val="0"/>
-          <w:numId w:val="1004"/>
+          <w:numId w:val="1003"/>
         </w:numPr>
         <w:pStyle w:val="Compact"/>
       </w:pPr>
@@ -2444,7 +3310,7 @@
       <w:pPr>
         <w:numPr>
           <w:ilvl w:val="0"/>
-          <w:numId w:val="1004"/>
+          <w:numId w:val="1003"/>
         </w:numPr>
         <w:pStyle w:val="Compact"/>
       </w:pPr>
@@ -2482,7 +3348,7 @@
       <w:pPr>
         <w:numPr>
           <w:ilvl w:val="0"/>
-          <w:numId w:val="1004"/>
+          <w:numId w:val="1003"/>
         </w:numPr>
         <w:pStyle w:val="Compact"/>
       </w:pPr>
@@ -2504,7 +3370,7 @@
       <w:pPr>
         <w:numPr>
           <w:ilvl w:val="0"/>
-          <w:numId w:val="1004"/>
+          <w:numId w:val="1003"/>
         </w:numPr>
         <w:pStyle w:val="Compact"/>
       </w:pPr>
@@ -2569,7 +3435,7 @@
       <w:pPr>
         <w:numPr>
           <w:ilvl w:val="0"/>
-          <w:numId w:val="1005"/>
+          <w:numId w:val="1004"/>
         </w:numPr>
         <w:pStyle w:val="Compact"/>
       </w:pPr>
@@ -2732,82 +3598,6 @@
       </w:pPr>
     </w:lvl>
   </w:abstractNum>
-  <w:abstractNum w:abstractNumId="991">
-    <w:nsid w:val="A991"/>
-    <w:multiLevelType w:val="multilevel"/>
-    <w:lvl w:ilvl="0">
-      <w:numFmt w:val="bullet"/>
-      <w:lvlText w:val="•"/>
-      <w:lvlJc w:val="left"/>
-      <w:pPr>
-        <w:ind w:left="720" w:hanging="480"/>
-      </w:pPr>
-    </w:lvl>
-    <w:lvl w:ilvl="1">
-      <w:numFmt w:val="bullet"/>
-      <w:lvlText w:val="–"/>
-      <w:lvlJc w:val="left"/>
-      <w:pPr>
-        <w:ind w:left="1440" w:hanging="480"/>
-      </w:pPr>
-    </w:lvl>
-    <w:lvl w:ilvl="2">
-      <w:numFmt w:val="bullet"/>
-      <w:lvlText w:val="•"/>
-      <w:lvlJc w:val="left"/>
-      <w:pPr>
-        <w:ind w:left="2160" w:hanging="480"/>
-      </w:pPr>
-    </w:lvl>
-    <w:lvl w:ilvl="3">
-      <w:numFmt w:val="bullet"/>
-      <w:lvlText w:val="–"/>
-      <w:lvlJc w:val="left"/>
-      <w:pPr>
-        <w:ind w:left="2880" w:hanging="480"/>
-      </w:pPr>
-    </w:lvl>
-    <w:lvl w:ilvl="4">
-      <w:numFmt w:val="bullet"/>
-      <w:lvlText w:val="•"/>
-      <w:lvlJc w:val="left"/>
-      <w:pPr>
-        <w:ind w:left="3600" w:hanging="480"/>
-      </w:pPr>
-    </w:lvl>
-    <w:lvl w:ilvl="5">
-      <w:numFmt w:val="bullet"/>
-      <w:lvlText w:val="–"/>
-      <w:lvlJc w:val="left"/>
-      <w:pPr>
-        <w:ind w:left="4320" w:hanging="480"/>
-      </w:pPr>
-    </w:lvl>
-    <w:lvl w:ilvl="6">
-      <w:numFmt w:val="bullet"/>
-      <w:lvlText w:val="•"/>
-      <w:lvlJc w:val="left"/>
-      <w:pPr>
-        <w:ind w:left="5040" w:hanging="480"/>
-      </w:pPr>
-    </w:lvl>
-    <w:lvl w:ilvl="7">
-      <w:numFmt w:val="bullet"/>
-      <w:lvlText w:val="–"/>
-      <w:lvlJc w:val="left"/>
-      <w:pPr>
-        <w:ind w:left="5760" w:hanging="480"/>
-      </w:pPr>
-    </w:lvl>
-    <w:lvl w:ilvl="8">
-      <w:numFmt w:val="bullet"/>
-      <w:lvlText w:val="•"/>
-      <w:lvlJc w:val="left"/>
-      <w:pPr>
-        <w:ind w:left="6480" w:hanging="480"/>
-      </w:pPr>
-    </w:lvl>
-  </w:abstractNum>
   <w:abstractNum w:abstractNumId="99411">
     <w:nsid w:val="A99411"/>
     <w:multiLevelType w:val="multilevel"/>
@@ -3152,9 +3942,6 @@
     <w:abstractNumId w:val="990"/>
   </w:num>
   <w:num w:numId="1001">
-    <w:abstractNumId w:val="991"/>
-  </w:num>
-  <w:num w:numId="1002">
     <w:abstractNumId w:val="99411"/>
     <w:lvlOverride w:ilvl="0">
       <w:startOverride w:val="1"/>
@@ -3184,7 +3971,7 @@
       <w:startOverride w:val="1"/>
     </w:lvlOverride>
   </w:num>
-  <w:num w:numId="1003">
+  <w:num w:numId="1002">
     <w:abstractNumId w:val="99413"/>
     <w:lvlOverride w:ilvl="0">
       <w:startOverride w:val="3"/>
@@ -3214,7 +4001,7 @@
       <w:startOverride w:val="3"/>
     </w:lvlOverride>
   </w:num>
-  <w:num w:numId="1004">
+  <w:num w:numId="1003">
     <w:abstractNumId w:val="99415"/>
     <w:lvlOverride w:ilvl="0">
       <w:startOverride w:val="5"/>
@@ -3244,7 +4031,7 @@
       <w:startOverride w:val="5"/>
     </w:lvlOverride>
   </w:num>
-  <w:num w:numId="1005">
+  <w:num w:numId="1004">
     <w:abstractNumId w:val="994114"/>
     <w:lvlOverride w:ilvl="0">
       <w:startOverride w:val="14"/>

</xml_diff>